<commit_message>
Simplify individual review title
</commit_message>
<xml_diff>
--- a/shared/templates/reviews/individual-review-v1.docx
+++ b/shared/templates/reviews/individual-review-v1.docx
@@ -263,7 +263,7 @@
         <w:b w:val="0"/>
         <w:sz w:val="20"/>
       </w:rPr>
-      <w:t>W. M. Keck Foundation – Research Program – Individual Review</w:t>
+      <w:t>W. M. Keck Foundation – Research Program – Review</w:t>
     </w:r>
   </w:p>
   <w:p>
@@ -404,7 +404,7 @@
       </w:rPr>
       <w:tab/>
       <w:tab/>
-      <w:t>Individual Proposal Review</w:t>
+      <w:t>Proposal Review</w:t>
     </w:r>
   </w:p>
 </w:hdr>

</xml_diff>